<commit_message>
Add opening sequence to the homepage and turn the binary rain white
First load of each session now opens with the name decoding out of
binary, a line of light drawing across the seam, and the night splitting
open along it while the starfield rushes past into the hero. Skippable
with any click, key, scroll, or tap. Never plays with reduced motion or
when arriving at a section link, and a CSS failsafe clears it if scripts
fail. Add ?intro to the URL to replay it.

Also: white starlight digits in the hero rain, and corrected wording in
the Creative Director and Software resume downloads.

Co-Authored-By: Claude Opus 5.5 <noreply@anthropic.com>
</commit_message>
<xml_diff>
--- a/public/resume/Sean_Despain_Resume_CreativeDirector_Brand.docx
+++ b/public/resume/Sean_Despain_Resume_CreativeDirector_Brand.docx
@@ -166,7 +166,7 @@
           <w:sz w:val="20"/>
           <w:szCs w:val="20"/>
         </w:rPr>
-        <w:t xml:space="preserve">Directed the "luminous premium healing" visual system across app and web: a chakra-accented palette, a Cormorant Garamond + Manrope typography system, and the App Store launch asset set. Produced and directed 300+ multimedia assets · graphics, video, and campaigns · for marketing, education, and retreat content.</w:t>
+        <w:t xml:space="preserve">Directed the "luminous premium healing" visual system across app and web: a chakra-accented palette, a Cormorant Garamond + Manrope typography system, and the App Store launch asset set. Produced and directed 300+ multimedia assets (graphics, video, and campaigns) for marketing, education, and retreat content.</w:t>
       </w:r>
     </w:p>
     <w:p>
@@ -220,7 +220,7 @@
           <w:sz w:val="20"/>
           <w:szCs w:val="20"/>
         </w:rPr>
-        <w:t xml:space="preserve">Created ten original princess characters and a complete visual system (an arch motif, an "invitation" gold-hairline device, and a crown mark used across the logo, favicon, and closing CTA) · designed from the ground up to avoid any resemblance to protected characters.</w:t>
+        <w:t xml:space="preserve">Created ten original princess characters and a complete visual system (an arch motif, an "invitation" gold-hairline device, and a crown mark used across the logo, favicon, and closing CTA), designed from the ground up to avoid any resemblance to protected characters.</w:t>
       </w:r>
     </w:p>
     <w:p>
@@ -328,7 +328,7 @@
           <w:sz w:val="20"/>
           <w:szCs w:val="20"/>
         </w:rPr>
-        <w:t xml:space="preserve">Directed a content-verification governance system (verified/source/proposed tiers) so ceremonial, cultural, medical, and legal content is never machine-translated or shipped unconfirmed · brand integrity applied to sensitive, cross-cultural material.</w:t>
+        <w:t xml:space="preserve">Directed a content-verification governance system (verified/source/proposed tiers) so ceremonial, cultural, medical, and legal content is never machine-translated or shipped unconfirmed: brand integrity applied to sensitive, cross-cultural material.</w:t>
       </w:r>
     </w:p>
     <w:p>

</xml_diff>